<commit_message>
Update resume MinionBOT stack to TypeScript and MongoDB
Co-authored-by: Cursor <cursoragent@cursor.com>
</commit_message>
<xml_diff>
--- a/Diksha Dorugade_QA Engineer.docx
+++ b/Diksha Dorugade_QA Engineer.docx
@@ -318,21 +318,7 @@
         <w:rPr>
           <w:rFonts w:ascii="Times New Roman" w:hAnsi="Times New Roman" w:cs="Times New Roman"/>
         </w:rPr>
-        <w:t xml:space="preserve">Recently developed AI-powered testing solutions at Zinnia, including </w:t>
-      </w:r>
-      <w:proofErr w:type="spellStart"/>
-      <w:r>
-        <w:rPr>
-          <w:rFonts w:ascii="Times New Roman" w:hAnsi="Times New Roman" w:cs="Times New Roman"/>
-        </w:rPr>
-        <w:t>MinionBOT</w:t>
-      </w:r>
-      <w:proofErr w:type="spellEnd"/>
-      <w:r>
-        <w:rPr>
-          <w:rFonts w:ascii="Times New Roman" w:hAnsi="Times New Roman" w:cs="Times New Roman"/>
-        </w:rPr>
-        <w:t xml:space="preserve"> — Zenius (AI test case generation) and an AI-powered defect analysis system leveraging NLP, Generative AI, and APIs. Certified in AI Test Case Generation using TestRail.</w:t>
+        <w:t>Recently developed AI-powered testing solutions at Zinnia, including MinionBOT — Zenius (AI test case generation) and an AI-powered defect analysis system leveraging NLP, Generative AI, and APIs. Certified in AI Test Case Generation using TestRail.</w:t>
       </w:r>
     </w:p>
     <w:p>
@@ -924,21 +910,7 @@
         <w:rPr>
           <w:rFonts w:ascii="Times New Roman" w:hAnsi="Times New Roman" w:cs="Times New Roman"/>
         </w:rPr>
-        <w:t xml:space="preserve">JIRA • </w:t>
-      </w:r>
-      <w:proofErr w:type="spellStart"/>
-      <w:r>
-        <w:rPr>
-          <w:rFonts w:ascii="Times New Roman" w:hAnsi="Times New Roman" w:cs="Times New Roman"/>
-        </w:rPr>
-        <w:t>qTest</w:t>
-      </w:r>
-      <w:proofErr w:type="spellEnd"/>
-      <w:r>
-        <w:rPr>
-          <w:rFonts w:ascii="Times New Roman" w:hAnsi="Times New Roman" w:cs="Times New Roman"/>
-        </w:rPr>
-        <w:t xml:space="preserve"> • TestRail • Zephyr • Test Strategy • Defect Lifecycle Management</w:t>
+        <w:t>JIRA • qTest • TestRail • Zephyr • Test Strategy • Defect Lifecycle Management</w:t>
       </w:r>
     </w:p>
     <w:p>
@@ -1134,23 +1106,13 @@
           <w:bCs/>
         </w:rPr>
       </w:pPr>
-      <w:proofErr w:type="spellStart"/>
-      <w:r>
-        <w:rPr>
-          <w:rFonts w:ascii="Times New Roman" w:hAnsi="Times New Roman" w:cs="Times New Roman"/>
-          <w:b/>
-          <w:bCs/>
-        </w:rPr>
-        <w:t>MinionBOT</w:t>
-      </w:r>
-      <w:proofErr w:type="spellEnd"/>
-      <w:r>
-        <w:rPr>
-          <w:rFonts w:ascii="Times New Roman" w:hAnsi="Times New Roman" w:cs="Times New Roman"/>
-          <w:b/>
-          <w:bCs/>
-        </w:rPr>
-        <w:t xml:space="preserve"> — Zenius</w:t>
+      <w:r>
+        <w:rPr>
+          <w:rFonts w:ascii="Times New Roman" w:hAnsi="Times New Roman" w:cs="Times New Roman"/>
+          <w:b/>
+          <w:bCs/>
+        </w:rPr>
+        <w:t>MinionBOT — Zenius</w:t>
       </w:r>
       <w:r>
         <w:rPr>
@@ -1177,7 +1139,7 @@
           <w:b/>
           <w:bCs/>
         </w:rPr>
-        <w:t>Technologies: Python | Flask | NLP | OpenAI API | MySQL | TestRail API | HTML/CSS/JS</w:t>
+        <w:t>Technologies: Python | Flask | NLP | OpenAI API | TypeScript | MongoDB</w:t>
       </w:r>
     </w:p>
     <w:p>
@@ -1218,7 +1180,7 @@
         <w:rPr>
           <w:rFonts w:ascii="Times New Roman" w:hAnsi="Times New Roman" w:cs="Times New Roman"/>
         </w:rPr>
-        <w:t>- Designed end-to-end workflow from requirements ingestion to structured functional test cases ready for review and TestRail integration.</w:t>
+        <w:t>- Designed end-to-end workflow from requirements ingestion to structured functional test cases, with a TypeScript UI and MongoDB-backed knowledge storage.</w:t>
       </w:r>
     </w:p>
     <w:p>
@@ -1596,35 +1558,7 @@
         <w:rPr>
           <w:rFonts w:ascii="Times New Roman" w:hAnsi="Times New Roman" w:cs="Times New Roman"/>
         </w:rPr>
-        <w:t xml:space="preserve">PyCharm, Postman, GIT, SQL Server, </w:t>
-      </w:r>
-      <w:proofErr w:type="spellStart"/>
-      <w:r>
-        <w:rPr>
-          <w:rFonts w:ascii="Times New Roman" w:hAnsi="Times New Roman" w:cs="Times New Roman"/>
-        </w:rPr>
-        <w:t>qTest</w:t>
-      </w:r>
-      <w:proofErr w:type="spellEnd"/>
-      <w:r>
-        <w:rPr>
-          <w:rFonts w:ascii="Times New Roman" w:hAnsi="Times New Roman" w:cs="Times New Roman"/>
-        </w:rPr>
-        <w:t xml:space="preserve">, JIRA, </w:t>
-      </w:r>
-      <w:proofErr w:type="spellStart"/>
-      <w:r>
-        <w:rPr>
-          <w:rFonts w:ascii="Times New Roman" w:hAnsi="Times New Roman" w:cs="Times New Roman"/>
-        </w:rPr>
-        <w:t>Katalon</w:t>
-      </w:r>
-      <w:proofErr w:type="spellEnd"/>
-      <w:r>
-        <w:rPr>
-          <w:rFonts w:ascii="Times New Roman" w:hAnsi="Times New Roman" w:cs="Times New Roman"/>
-        </w:rPr>
-        <w:t xml:space="preserve"> Studio, SOAP UI</w:t>
+        <w:t>PyCharm, Postman, GIT, SQL Server, qTest, JIRA, Katalon Studio, SOAP UI</w:t>
       </w:r>
     </w:p>
     <w:p>
@@ -1727,14 +1661,7 @@
         <w:rPr>
           <w:rFonts w:ascii="Times New Roman" w:hAnsi="Times New Roman" w:cs="Times New Roman"/>
         </w:rPr>
-        <w:t xml:space="preserve"> </w:t>
-      </w:r>
-      <w:proofErr w:type="gramStart"/>
-      <w:r>
-        <w:rPr>
-          <w:rFonts w:ascii="Times New Roman" w:hAnsi="Times New Roman" w:cs="Times New Roman"/>
-        </w:rPr>
-        <w:t>includ</w:t>
+        <w:t xml:space="preserve"> includ</w:t>
       </w:r>
       <w:r>
         <w:rPr>
@@ -1742,7 +1669,6 @@
         </w:rPr>
         <w:t>es</w:t>
       </w:r>
-      <w:proofErr w:type="gramEnd"/>
       <w:r>
         <w:rPr>
           <w:rFonts w:ascii="Times New Roman" w:hAnsi="Times New Roman" w:cs="Times New Roman"/>
@@ -1934,14 +1860,12 @@
         </w:rPr>
         <w:t> </w:t>
       </w:r>
-      <w:proofErr w:type="spellStart"/>
       <w:r>
         <w:rPr>
           <w:rFonts w:ascii="Times New Roman" w:hAnsi="Times New Roman" w:cs="Times New Roman"/>
         </w:rPr>
         <w:t>Pycharm</w:t>
       </w:r>
-      <w:proofErr w:type="spellEnd"/>
       <w:r>
         <w:rPr>
           <w:rFonts w:ascii="Times New Roman" w:hAnsi="Times New Roman" w:cs="Times New Roman"/>
@@ -2193,7 +2117,6 @@
           <w:szCs w:val="20"/>
         </w:rPr>
       </w:pPr>
-      <w:proofErr w:type="spellStart"/>
       <w:r>
         <w:rPr>
           <w:rFonts w:ascii="Calibri" w:eastAsia="Calibri" w:hAnsi="Calibri" w:cs="Calibri"/>
@@ -2215,19 +2138,7 @@
           <w:sz w:val="20"/>
           <w:szCs w:val="20"/>
         </w:rPr>
-        <w:t>nspire</w:t>
-      </w:r>
-      <w:proofErr w:type="spellEnd"/>
-      <w:r>
-        <w:rPr>
-          <w:rFonts w:ascii="Calibri" w:eastAsia="Calibri" w:hAnsi="Calibri" w:cs="Calibri"/>
-          <w:b/>
-          <w:bCs/>
-          <w:color w:val="00A2FF"/>
-          <w:sz w:val="20"/>
-          <w:szCs w:val="20"/>
-        </w:rPr>
-        <w:t>/SANVEO INC</w:t>
+        <w:t>nspire/SANVEO INC</w:t>
       </w:r>
       <w:r>
         <w:rPr>
@@ -2561,21 +2472,7 @@
         <w:rPr>
           <w:rFonts w:ascii="Times New Roman" w:hAnsi="Times New Roman" w:cs="Times New Roman"/>
         </w:rPr>
-        <w:t xml:space="preserve">Eclipse, Jira, Git, Postman, JMeter, Selenium IDE, </w:t>
-      </w:r>
-      <w:proofErr w:type="spellStart"/>
-      <w:r>
-        <w:rPr>
-          <w:rFonts w:ascii="Times New Roman" w:hAnsi="Times New Roman" w:cs="Times New Roman"/>
-        </w:rPr>
-        <w:t>Postgre</w:t>
-      </w:r>
-      <w:proofErr w:type="spellEnd"/>
-      <w:r>
-        <w:rPr>
-          <w:rFonts w:ascii="Times New Roman" w:hAnsi="Times New Roman" w:cs="Times New Roman"/>
-        </w:rPr>
-        <w:t xml:space="preserve"> SQL, Test Collab, Visual Studio</w:t>
+        <w:t>Eclipse, Jira, Git, Postman, JMeter, Selenium IDE, Postgre SQL, Test Collab, Visual Studio</w:t>
       </w:r>
     </w:p>
     <w:p>
@@ -2881,39 +2778,7 @@
           <w:sz w:val="22"/>
           <w:szCs w:val="22"/>
         </w:rPr>
-        <w:t xml:space="preserve">Zinnia Caught </w:t>
-      </w:r>
-      <w:proofErr w:type="gramStart"/>
-      <w:r>
-        <w:rPr>
-          <w:sz w:val="22"/>
-          <w:szCs w:val="22"/>
-        </w:rPr>
-        <w:t>In</w:t>
-      </w:r>
-      <w:proofErr w:type="gramEnd"/>
-      <w:r>
-        <w:rPr>
-          <w:sz w:val="22"/>
-          <w:szCs w:val="22"/>
-        </w:rPr>
-        <w:t xml:space="preserve"> </w:t>
-      </w:r>
-      <w:proofErr w:type="gramStart"/>
-      <w:r>
-        <w:rPr>
-          <w:sz w:val="22"/>
-          <w:szCs w:val="22"/>
-        </w:rPr>
-        <w:t>The</w:t>
-      </w:r>
-      <w:proofErr w:type="gramEnd"/>
-      <w:r>
-        <w:rPr>
-          <w:sz w:val="22"/>
-          <w:szCs w:val="22"/>
-        </w:rPr>
-        <w:t xml:space="preserve"> Act Award (2023)</w:t>
+        <w:t>Zinnia Caught In The Act Award (2023)</w:t>
       </w:r>
     </w:p>
     <w:p>
@@ -3078,21 +2943,12 @@
           <w:szCs w:val="22"/>
         </w:rPr>
       </w:pPr>
-      <w:proofErr w:type="gramStart"/>
       <w:r>
         <w:rPr>
           <w:sz w:val="22"/>
           <w:szCs w:val="22"/>
         </w:rPr>
-        <w:t>Bachelor’s</w:t>
-      </w:r>
-      <w:proofErr w:type="gramEnd"/>
-      <w:r>
-        <w:rPr>
-          <w:sz w:val="22"/>
-          <w:szCs w:val="22"/>
-        </w:rPr>
-        <w:t xml:space="preserve"> in computer engineering from Rajiv Gandhi Institute of Technology, Andheri (W)</w:t>
+        <w:t>Bachelor’s in computer engineering from Rajiv Gandhi Institute of Technology, Andheri (W)</w:t>
       </w:r>
     </w:p>
     <w:p>

</xml_diff>